<commit_message>
R9 UR2: rewrite clunky English (unconfirmed/unresolved pile-up, vague 'the case'/'safe staff review', odd 'recreate') into plain wording; sync to 中文 + framework translation md and 3 docx (run-level, format preserved)
</commit_message>
<xml_diff>
--- a/08_组员资料/ID-Coo_报告提交框架_R9完成_R10四页版_中文翻译.docx
+++ b/08_组员资料/ID-Coo_报告提交框架_R9完成_R10四页版_中文翻译.docx
@@ -3253,7 +3253,7 @@
           <w:rFonts w:ascii="微软雅黑" w:eastAsia="微软雅黑" w:hAnsi="微软雅黑" w:cs="微软雅黑" w:hint="eastAsia"/>
           <w:lang w:eastAsia="zh-CN"/>
         </w:rPr>
-        <w:t>：对无法确认的身份，系统必须保持其未解决状态，并提供给人员进行安全复核，复核无法继续时暂停进牛。耳标可能丢失或无法读取</w:t>
+        <w:t>：系统绝不可以猜测身份。若标识符无法读取或确认，该次通行必须保持“未确认”并转交人员复核；若复核无法安全完成，则暂停进牛。耳标可能丢失或无法读取</w:t>
       </w:r>
       <w:r>
         <w:t xml:space="preserve"> [3]</w:t>
@@ -3273,7 +3273,7 @@
           <w:rFonts w:ascii="微软雅黑" w:eastAsia="微软雅黑" w:hAnsi="微软雅黑" w:cs="微软雅黑" w:hint="eastAsia"/>
           <w:lang w:eastAsia="zh-CN"/>
         </w:rPr>
-        <w:t>；猜测身份会重蹈原始记录错误。</w:t>
+        <w:t>；猜测身份只会重复本系统要消除的记录错误。</w:t>
       </w:r>
     </w:p>
     <w:p>

</xml_diff>

<commit_message>
R10: (1) reword 'rather than invent a number' -> 'no identity is entered without official confirmation' (md+5 docx); (2) rename 'Version 1'-as-system-name -> ID-Coo, keep release-scope 'Version 1' (11 files); (3) delete 'Not to scale...' + 'Single-file race' from fig1 and 'Functional concept only...' from fig2, sync drawio sources (x3) + scripts; (4) fig labels 'in v1'->'(v1)', 'v1 export'->'export (v1)'; (5) _修复.docx: enlarged-grey fig1 + updated fig2 injected
</commit_message>
<xml_diff>
--- a/08_组员资料/ID-Coo_报告提交框架_R9完成_R10四页版_中文翻译.docx
+++ b/08_组员资料/ID-Coo_报告提交框架_R9完成_R10四页版_中文翻译.docx
@@ -3682,7 +3682,7 @@
           <w:rFonts w:ascii="微软雅黑" w:eastAsia="微软雅黑" w:hAnsi="微软雅黑" w:cs="微软雅黑" w:hint="eastAsia"/>
           <w:lang w:eastAsia="zh-CN"/>
         </w:rPr>
-        <w:t>第一版设一个缓冲段和一个检测段。增加上游段只会增加等待空间、不会提高</w:t>
+        <w:t>ID-Coo 设一个缓冲段和一个检测段。增加上游段只会增加等待空间、不会提高</w:t>
       </w:r>
       <w:r>
         <w:t>"</w:t>
@@ -4818,7 +4818,7 @@
           <w:rFonts w:ascii="微软雅黑" w:eastAsia="微软雅黑" w:hAnsi="微软雅黑" w:cs="微软雅黑" w:hint="eastAsia"/>
           <w:lang w:eastAsia="zh-CN"/>
         </w:rPr>
-        <w:t>事件编号与官方身份保持分离。若未读到标签，身份栏保持空白直至人员核验；原始异常与后续关联保持可审计。若官方可视标识也不足，人员按官方程序处理，而不是编造编号。</w:t>
+        <w:t>事件编号与官方身份保持分离。若未读到标签，身份栏保持空白直至人员核验；原始异常与后续关联保持可审计。若官方可视标识也不足，人员按官方程序处理；未经官方确认，不得录入身份。</w:t>
       </w:r>
     </w:p>
     <w:p>
@@ -4913,7 +4913,7 @@
           <w:rFonts w:ascii="微软雅黑" w:eastAsia="微软雅黑" w:hAnsi="微软雅黑" w:cs="微软雅黑" w:hint="eastAsia"/>
           <w:lang w:eastAsia="zh-CN"/>
         </w:rPr>
-        <w:t>第一版在本地保存记录并导出以供审计；不假定直接接入</w:t>
+        <w:t>ID-Coo 在本地保存记录并导出以供审计；不假定直接接入</w:t>
       </w:r>
       <w:r>
         <w:t xml:space="preserve"> LIS</w:t>

</xml_diff>